<commit_message>
Clarify the Aragam Figure 5b example
</commit_message>
<xml_diff>
--- a/test_data/real_data/PEG_real_data_example_explanation.docx
+++ b/test_data/real_data/PEG_real_data_example_explanation.docx
@@ -121,7 +121,7 @@
         </w:numPr>
       </w:pPr>
       <w:r>
-        <w:t>Contains 44 prioritised gene records together with indicators showing which evidence types support each prioritisation.</w:t>
+        <w:t>Contains the 44 most likely causal genes displayed in Aragam et al. Figure 5b. Each is supported by at least four agreeing predictors, and one displayed sentinel association is retained per gene.</w:t>
       </w:r>
     </w:p>
     <w:p>
@@ -137,7 +137,7 @@
         </w:numPr>
       </w:pPr>
       <w:r>
-        <w:t>Evidence columns are represented as True/False, and each evidence-count column records the number of supporting matrix rows.</w:t>
+        <w:t>Evidence columns are represented as True/False, and each evidence-count column records the number of supporting evidence predictors for that variant-gene pair.</w:t>
       </w:r>
     </w:p>
     <w:p>
@@ -154,7 +154,7 @@
       </w:pPr>
       <w:proofErr w:type="spellStart"/>
       <w:r>
-        <w:t>INT_author_conclusion is stored in the matrix. The list contains only variant–gene pairs whose matrix row has a positive author conclusion, without duplicating the conclusion column.</w:t>
+        <w:t>In this demonstration fixture, INT_author_conclusion identifies the 44-row Figure 5b display subset, not every author-prioritised gene in Supplementary Table 31. Each list row copies its value from the matching matrix row.</w:t>
       </w:r>
       <w:proofErr w:type="spellEnd"/>
       <w:r/>

</xml_diff>